<commit_message>
creation de l'interface de vente de ligne de vente
</commit_message>
<xml_diff>
--- a/Un Cahier des Charges.docx
+++ b/Un Cahier des Charges.docx
@@ -297,29 +297,16 @@
           <w:lang w:eastAsia="fr-FR"/>
         </w:rPr>
       </w:pPr>
-      <w:proofErr w:type="gramStart"/>
-      <w:r>
-        <w:rPr>
-          <w:rFonts w:ascii="Times New Roman" w:eastAsia="Times New Roman" w:hAnsi="Times New Roman" w:cs="Times New Roman"/>
-          <w:b/>
-          <w:bCs/>
-          <w:sz w:val="24"/>
-          <w:szCs w:val="24"/>
-          <w:lang w:eastAsia="fr-FR"/>
-        </w:rPr>
-        <w:t>Intégration matériel</w:t>
-      </w:r>
-      <w:proofErr w:type="gramEnd"/>
-      <w:r>
-        <w:rPr>
-          <w:rFonts w:ascii="Times New Roman" w:eastAsia="Times New Roman" w:hAnsi="Times New Roman" w:cs="Times New Roman"/>
-          <w:b/>
-          <w:bCs/>
-          <w:sz w:val="24"/>
-          <w:szCs w:val="24"/>
-          <w:lang w:eastAsia="fr-FR"/>
-        </w:rPr>
-        <w:t xml:space="preserve"> :</w:t>
+      <w:r>
+        <w:rPr>
+          <w:rFonts w:ascii="Times New Roman" w:eastAsia="Times New Roman" w:hAnsi="Times New Roman" w:cs="Times New Roman"/>
+          <w:b/>
+          <w:bCs/>
+          <w:sz w:val="24"/>
+          <w:szCs w:val="24"/>
+          <w:lang w:eastAsia="fr-FR"/>
+        </w:rPr>
+        <w:t>Intégration matériel :</w:t>
       </w:r>
       <w:r>
         <w:rPr>
@@ -508,27 +495,7 @@
           <w:szCs w:val="24"/>
           <w:lang w:eastAsia="fr-FR"/>
         </w:rPr>
-        <w:t>Nom commercial et scientifique (</w:t>
-      </w:r>
-      <w:proofErr w:type="gramStart"/>
-      <w:r>
-        <w:rPr>
-          <w:rFonts w:ascii="Times New Roman" w:eastAsia="Times New Roman" w:hAnsi="Times New Roman" w:cs="Times New Roman"/>
-          <w:sz w:val="24"/>
-          <w:szCs w:val="24"/>
-          <w:lang w:eastAsia="fr-FR"/>
-        </w:rPr>
-        <w:t>ex:</w:t>
-      </w:r>
-      <w:proofErr w:type="gramEnd"/>
-      <w:r>
-        <w:rPr>
-          <w:rFonts w:ascii="Times New Roman" w:eastAsia="Times New Roman" w:hAnsi="Times New Roman" w:cs="Times New Roman"/>
-          <w:sz w:val="24"/>
-          <w:szCs w:val="24"/>
-          <w:lang w:eastAsia="fr-FR"/>
-        </w:rPr>
-        <w:t xml:space="preserve"> </w:t>
+        <w:t xml:space="preserve">Nom commercial et scientifique (ex: </w:t>
       </w:r>
       <w:r>
         <w:rPr>
@@ -539,45 +506,8 @@
           <w:szCs w:val="24"/>
           <w:lang w:eastAsia="fr-FR"/>
         </w:rPr>
-        <w:t xml:space="preserve">Loup de mer / </w:t>
-      </w:r>
-      <w:proofErr w:type="spellStart"/>
-      <w:r>
-        <w:rPr>
-          <w:rFonts w:ascii="Times New Roman" w:eastAsia="Times New Roman" w:hAnsi="Times New Roman" w:cs="Times New Roman"/>
-          <w:i/>
-          <w:iCs/>
-          <w:sz w:val="24"/>
-          <w:szCs w:val="24"/>
-          <w:lang w:eastAsia="fr-FR"/>
-        </w:rPr>
-        <w:t>Dicentrarchus</w:t>
-      </w:r>
-      <w:proofErr w:type="spellEnd"/>
-      <w:r>
-        <w:rPr>
-          <w:rFonts w:ascii="Times New Roman" w:eastAsia="Times New Roman" w:hAnsi="Times New Roman" w:cs="Times New Roman"/>
-          <w:i/>
-          <w:iCs/>
-          <w:sz w:val="24"/>
-          <w:szCs w:val="24"/>
-          <w:lang w:eastAsia="fr-FR"/>
-        </w:rPr>
-        <w:t xml:space="preserve"> </w:t>
-      </w:r>
-      <w:proofErr w:type="spellStart"/>
-      <w:r>
-        <w:rPr>
-          <w:rFonts w:ascii="Times New Roman" w:eastAsia="Times New Roman" w:hAnsi="Times New Roman" w:cs="Times New Roman"/>
-          <w:i/>
-          <w:iCs/>
-          <w:sz w:val="24"/>
-          <w:szCs w:val="24"/>
-          <w:lang w:eastAsia="fr-FR"/>
-        </w:rPr>
-        <w:t>labrax</w:t>
-      </w:r>
-      <w:proofErr w:type="spellEnd"/>
+        <w:t>Loup de mer / Dicentrarchus labrax</w:t>
+      </w:r>
       <w:r>
         <w:rPr>
           <w:rFonts w:ascii="Times New Roman" w:eastAsia="Times New Roman" w:hAnsi="Times New Roman" w:cs="Times New Roman"/>
@@ -609,27 +539,7 @@
           <w:szCs w:val="24"/>
           <w:lang w:eastAsia="fr-FR"/>
         </w:rPr>
-        <w:t>Zone de capture (</w:t>
-      </w:r>
-      <w:proofErr w:type="gramStart"/>
-      <w:r>
-        <w:rPr>
-          <w:rFonts w:ascii="Times New Roman" w:eastAsia="Times New Roman" w:hAnsi="Times New Roman" w:cs="Times New Roman"/>
-          <w:sz w:val="24"/>
-          <w:szCs w:val="24"/>
-          <w:lang w:eastAsia="fr-FR"/>
-        </w:rPr>
-        <w:t>ex:</w:t>
-      </w:r>
-      <w:proofErr w:type="gramEnd"/>
-      <w:r>
-        <w:rPr>
-          <w:rFonts w:ascii="Times New Roman" w:eastAsia="Times New Roman" w:hAnsi="Times New Roman" w:cs="Times New Roman"/>
-          <w:sz w:val="24"/>
-          <w:szCs w:val="24"/>
-          <w:lang w:eastAsia="fr-FR"/>
-        </w:rPr>
-        <w:t xml:space="preserve"> Zone FAO) ou pays d'élevage.</w:t>
+        <w:t>Zone de capture (ex: Zone FAO) ou pays d'élevage.</w:t>
       </w:r>
     </w:p>
     <w:p>
@@ -653,27 +563,7 @@
           <w:szCs w:val="24"/>
           <w:lang w:eastAsia="fr-FR"/>
         </w:rPr>
-        <w:t>Méthode de pêche (</w:t>
-      </w:r>
-      <w:proofErr w:type="gramStart"/>
-      <w:r>
-        <w:rPr>
-          <w:rFonts w:ascii="Times New Roman" w:eastAsia="Times New Roman" w:hAnsi="Times New Roman" w:cs="Times New Roman"/>
-          <w:sz w:val="24"/>
-          <w:szCs w:val="24"/>
-          <w:lang w:eastAsia="fr-FR"/>
-        </w:rPr>
-        <w:t>ex:</w:t>
-      </w:r>
-      <w:proofErr w:type="gramEnd"/>
-      <w:r>
-        <w:rPr>
-          <w:rFonts w:ascii="Times New Roman" w:eastAsia="Times New Roman" w:hAnsi="Times New Roman" w:cs="Times New Roman"/>
-          <w:sz w:val="24"/>
-          <w:szCs w:val="24"/>
-          <w:lang w:eastAsia="fr-FR"/>
-        </w:rPr>
-        <w:t xml:space="preserve"> chalut, ligne, filet).</w:t>
+        <w:t>Méthode de pêche (ex: chalut, ligne, filet).</w:t>
       </w:r>
     </w:p>
     <w:p>
@@ -838,27 +728,7 @@
           <w:szCs w:val="24"/>
           <w:lang w:eastAsia="fr-FR"/>
         </w:rPr>
-        <w:t xml:space="preserve"> Enregistrement des poissons avariés, jetés ou transformés (</w:t>
-      </w:r>
-      <w:proofErr w:type="gramStart"/>
-      <w:r>
-        <w:rPr>
-          <w:rFonts w:ascii="Times New Roman" w:eastAsia="Times New Roman" w:hAnsi="Times New Roman" w:cs="Times New Roman"/>
-          <w:sz w:val="24"/>
-          <w:szCs w:val="24"/>
-          <w:lang w:eastAsia="fr-FR"/>
-        </w:rPr>
-        <w:t>ex:</w:t>
-      </w:r>
-      <w:proofErr w:type="gramEnd"/>
-      <w:r>
-        <w:rPr>
-          <w:rFonts w:ascii="Times New Roman" w:eastAsia="Times New Roman" w:hAnsi="Times New Roman" w:cs="Times New Roman"/>
-          <w:sz w:val="24"/>
-          <w:szCs w:val="24"/>
-          <w:lang w:eastAsia="fr-FR"/>
-        </w:rPr>
-        <w:t xml:space="preserve"> darne, filet, soupe).</w:t>
+        <w:t xml:space="preserve"> Enregistrement des poissons avariés, jetés ou transformés (ex: darne, filet, soupe).</w:t>
       </w:r>
     </w:p>
     <w:p>
@@ -928,27 +798,7 @@
           <w:szCs w:val="24"/>
           <w:lang w:eastAsia="fr-FR"/>
         </w:rPr>
-        <w:t xml:space="preserve"> Conversion d'un produit brut en produit préparé (</w:t>
-      </w:r>
-      <w:proofErr w:type="gramStart"/>
-      <w:r>
-        <w:rPr>
-          <w:rFonts w:ascii="Times New Roman" w:eastAsia="Times New Roman" w:hAnsi="Times New Roman" w:cs="Times New Roman"/>
-          <w:sz w:val="24"/>
-          <w:szCs w:val="24"/>
-          <w:lang w:eastAsia="fr-FR"/>
-        </w:rPr>
-        <w:t>ex:</w:t>
-      </w:r>
-      <w:proofErr w:type="gramEnd"/>
-      <w:r>
-        <w:rPr>
-          <w:rFonts w:ascii="Times New Roman" w:eastAsia="Times New Roman" w:hAnsi="Times New Roman" w:cs="Times New Roman"/>
-          <w:sz w:val="24"/>
-          <w:szCs w:val="24"/>
-          <w:lang w:eastAsia="fr-FR"/>
-        </w:rPr>
-        <w:t xml:space="preserve"> passage d'un poisson entier à un poids net de filets avec ajustement automatique du stock).</w:t>
+        <w:t xml:space="preserve"> Conversion d'un produit brut en produit préparé (ex: passage d'un poisson entier à un poids net de filets avec ajustement automatique du stock).</w:t>
       </w:r>
     </w:p>
     <w:p>
@@ -1104,21 +954,8 @@
           <w:szCs w:val="24"/>
           <w:lang w:eastAsia="fr-FR"/>
         </w:rPr>
-        <w:t xml:space="preserve">E. Tableaux de Bord &amp; </w:t>
-      </w:r>
-      <w:proofErr w:type="spellStart"/>
-      <w:r>
-        <w:rPr>
-          <w:rFonts w:ascii="Times New Roman" w:eastAsia="Times New Roman" w:hAnsi="Times New Roman" w:cs="Times New Roman"/>
-          <w:b/>
-          <w:bCs/>
-          <w:sz w:val="24"/>
-          <w:szCs w:val="24"/>
-          <w:lang w:eastAsia="fr-FR"/>
-        </w:rPr>
-        <w:t>Reporting</w:t>
-      </w:r>
-      <w:proofErr w:type="spellEnd"/>
+        <w:t>E. Tableaux de Bord &amp; Reporting</w:t>
+      </w:r>
     </w:p>
     <w:p>
       <w:pPr>
@@ -1352,27 +1189,7 @@
           <w:szCs w:val="24"/>
           <w:lang w:eastAsia="fr-FR"/>
         </w:rPr>
-        <w:t xml:space="preserve"> Gestion des droits d'accès selon le profil (</w:t>
-      </w:r>
-      <w:proofErr w:type="gramStart"/>
-      <w:r>
-        <w:rPr>
-          <w:rFonts w:ascii="Times New Roman" w:eastAsia="Times New Roman" w:hAnsi="Times New Roman" w:cs="Times New Roman"/>
-          <w:sz w:val="24"/>
-          <w:szCs w:val="24"/>
-          <w:lang w:eastAsia="fr-FR"/>
-        </w:rPr>
-        <w:t>ex:</w:t>
-      </w:r>
-      <w:proofErr w:type="gramEnd"/>
-      <w:r>
-        <w:rPr>
-          <w:rFonts w:ascii="Times New Roman" w:eastAsia="Times New Roman" w:hAnsi="Times New Roman" w:cs="Times New Roman"/>
-          <w:sz w:val="24"/>
-          <w:szCs w:val="24"/>
-          <w:lang w:eastAsia="fr-FR"/>
-        </w:rPr>
-        <w:t xml:space="preserve"> interdiction pour les vendeurs de modifier les prix d'achat).</w:t>
+        <w:t xml:space="preserve"> Gestion des droits d'accès selon le profil (ex: interdiction pour les vendeurs de modifier les prix d'achat).</w:t>
       </w:r>
     </w:p>
     <w:p>
@@ -1576,6 +1393,179 @@
       </w:r>
     </w:p>
     <w:p/>
+    <w:p>
+      <w:r>
+        <w:t>Dans le cadre d'un logiciel de gestion de poissonnerie, la **toute première fonctionnalité à créer** (le cœur du système / MVP) est :</w:t>
+      </w:r>
+    </w:p>
+    <w:p/>
+    <w:p>
+      <w:r>
+        <w:t xml:space="preserve">### </w:t>
+      </w:r>
+      <w:r>
+        <w:rPr>
+          <w:rFonts w:ascii="Segoe UI Emoji" w:hAnsi="Segoe UI Emoji" w:cs="Segoe UI Emoji"/>
+        </w:rPr>
+        <w:t>🛒</w:t>
+      </w:r>
+      <w:r>
+        <w:t xml:space="preserve"> **La Gestion des Produits et de la Vente au Poids (Caisse / POS)**</w:t>
+      </w:r>
+    </w:p>
+    <w:p/>
+    <w:p>
+      <w:r>
+        <w:t>---</w:t>
+      </w:r>
+    </w:p>
+    <w:p/>
+    <w:p>
+      <w:r>
+        <w:t>### Pourquoi commencer par cette fonctionnalité ?</w:t>
+      </w:r>
+    </w:p>
+    <w:p/>
+    <w:p>
+      <w:r>
+        <w:t>1. **Valeur métier immédiate :** C'est le cœur de l'activité quotidienne d'une poissonnerie. Sans encaissement ni pesée, le commerce ne peut pas fonctionner.</w:t>
+      </w:r>
+    </w:p>
+    <w:p>
+      <w:r>
+        <w:t>2. **Spécificité clé du secteur :** Contrairement à un commerce classique, la poissonnerie vend des produits au kilo avec des cours de marée fluctuants. Valider la logique de calcul `Prix du jour × Poids` est la brique fondamentale.</w:t>
+      </w:r>
+    </w:p>
+    <w:p>
+      <w:r>
+        <w:lastRenderedPageBreak/>
+        <w:t>3. **Moteur des autres modules :** C'est l'acte de vente qui déclenche :</w:t>
+      </w:r>
+    </w:p>
+    <w:p>
+      <w:r>
+        <w:t>* La sortie de stock automatique.</w:t>
+      </w:r>
+    </w:p>
+    <w:p>
+      <w:r>
+        <w:t>* L'enregistrement du Chiffre d'Affaires (alimentant votre tableau de bord).</w:t>
+      </w:r>
+    </w:p>
+    <w:p>
+      <w:r>
+        <w:t>* L'historisation des transactions et le suivi de la traçabilité.</w:t>
+      </w:r>
+    </w:p>
+    <w:p/>
+    <w:p/>
+    <w:p/>
+    <w:p>
+      <w:r>
+        <w:t>---</w:t>
+      </w:r>
+    </w:p>
+    <w:p/>
+    <w:p>
+      <w:r>
+        <w:t>### Sous-fonctions à développer pour ce premier module :</w:t>
+      </w:r>
+    </w:p>
+    <w:p/>
+    <w:p>
+      <w:r>
+        <w:t>1. **Le Catalogue Produit (Référentiel) :**</w:t>
+      </w:r>
+    </w:p>
+    <w:p>
+      <w:r>
+        <w:t>* Nom commercial et nom scientifique (ex: *Loup de Mer / Dicentrarchus labrax*).</w:t>
+      </w:r>
+    </w:p>
+    <w:p>
+      <w:r>
+        <w:t>* Type de tarification : au kilo (Kg) ou à la pièce.</w:t>
+      </w:r>
+    </w:p>
+    <w:p>
+      <w:r>
+        <w:t>* Prix de vente au Kg (ajustable selon le cours du jour).</w:t>
+      </w:r>
+    </w:p>
+    <w:p/>
+    <w:p/>
+    <w:p>
+      <w:r>
+        <w:t>2. **L'Interface de Saisie des Ventes (Écran Caisse) :**</w:t>
+      </w:r>
+    </w:p>
+    <w:p>
+      <w:r>
+        <w:t>* Sélection rapide du produit (boutons visuels / recherche).</w:t>
+      </w:r>
+    </w:p>
+    <w:p>
+      <w:r>
+        <w:t>* Saisie du poids (manuelle ou via lecture de la balance).</w:t>
+      </w:r>
+    </w:p>
+    <w:p>
+      <w:r>
+        <w:t>* Calcul instantané du sous-total et total du panier.</w:t>
+      </w:r>
+    </w:p>
+    <w:p>
+      <w:r>
+        <w:t>* Enregistrement du mode de règlement (Espèces, Carte, etc.) et validation de la vente.</w:t>
+      </w:r>
+    </w:p>
+    <w:p/>
+    <w:p/>
+    <w:p/>
+    <w:p>
+      <w:r>
+        <w:t>---</w:t>
+      </w:r>
+    </w:p>
+    <w:p/>
+    <w:p>
+      <w:r>
+        <w:t>### Ordre de développement recommandé pour la suite :</w:t>
+      </w:r>
+    </w:p>
+    <w:p/>
+    <w:p>
+      <w:r>
+        <w:t>```</w:t>
+      </w:r>
+    </w:p>
+    <w:p>
+      <w:r>
+        <w:t>1. Vente au Poids &amp; Caisse (Essentiel / Fondations)</w:t>
+      </w:r>
+    </w:p>
+    <w:p>
+      <w:r>
+        <w:lastRenderedPageBreak/>
+        <w:t xml:space="preserve">   └──&gt; 2. Entrées en Stock &amp; Gestion des Lots (DLC / Origine FAO)</w:t>
+      </w:r>
+    </w:p>
+    <w:p>
+      <w:r>
+        <w:t xml:space="preserve">          └──&gt; 3. Suivi de la Casse, Pertes &amp; Transformation (Nettoyage/Filetage)</w:t>
+      </w:r>
+    </w:p>
+    <w:p>
+      <w:r>
+        <w:t xml:space="preserve">                 └──&gt; 4. Alimentation dynamique du Tableau de Bord</w:t>
+      </w:r>
+    </w:p>
+    <w:p/>
+    <w:p>
+      <w:r>
+        <w:t>```</w:t>
+      </w:r>
+    </w:p>
     <w:sectPr>
       <w:pgSz w:w="11906" w:h="16838"/>
       <w:pgMar w:top="1440" w:right="1440" w:bottom="1440" w:left="1440" w:header="708" w:footer="708" w:gutter="0"/>

</xml_diff>